<commit_message>
Add dev notes #7-#12 from staging-site review; refresh docx
Fold in findings: canonical tagline in hero (#7), remove advocacy/policy
language sitewide (#8), fix Milan's title to President & Co-Founder (#9),
remove/reframe the $100K research-grants stat per legacy rule (#10), replace
placeholder events with real ones incl. the Nov 21 Blackhawk gala (#11), and
technical launch-blockers noindex + broken og:image (#12). Regenerate the Word
version to match.

Co-Authored-By: Claude Opus 4.8 <noreply@anthropic.com>
Claude-Session: https://claude.ai/code/session_01JeBBSnHfYM2VP8sZY3cQRp
</commit_message>
<xml_diff>
--- a/content/website-developer-notes.docx
+++ b/content/website-developer-notes.docx
@@ -999,6 +999,452 @@
         <w:t xml:space="preserve"> section.</w:t>
       </w:r>
     </w:p>
+    <w:p>
+      <w:pPr>
+        <w:pStyle w:val="Heading3"/>
+      </w:pPr>
+      <w:r>
+        <w:rPr>
+          <w:color w:val="181D27"/>
+        </w:rPr>
+        <w:t>7. Hero — use the canonical tagline</w:t>
+      </w:r>
+    </w:p>
+    <w:p>
+      <w:pPr>
+        <w:pStyle w:val="ListBullet"/>
+      </w:pPr>
+      <w:r>
+        <w:rPr>
+          <w:b/>
+        </w:rPr>
+        <w:t>Page:</w:t>
+      </w:r>
+      <w:r>
+        <w:t xml:space="preserve"> Landing / Home (hero)</w:t>
+      </w:r>
+    </w:p>
+    <w:p>
+      <w:pPr>
+        <w:pStyle w:val="ListBullet"/>
+      </w:pPr>
+      <w:r>
+        <w:rPr>
+          <w:b/>
+        </w:rPr>
+        <w:t>Problem:</w:t>
+      </w:r>
+      <w:r>
+        <w:t xml:space="preserve"> The finalized tagline is not on the site. The hero reads "Bringing hope to children fighting DIPG" with a subhead about "research, advocacy, and care."</w:t>
+      </w:r>
+    </w:p>
+    <w:p>
+      <w:pPr>
+        <w:pStyle w:val="ListBullet"/>
+      </w:pPr>
+      <w:r>
+        <w:rPr>
+          <w:b/>
+        </w:rPr>
+        <w:t>Change:</w:t>
+      </w:r>
+      <w:r>
+        <w:t xml:space="preserve"> Use the canonical tagline </w:t>
+      </w:r>
+      <w:r>
+        <w:rPr>
+          <w:b/>
+        </w:rPr>
+        <w:t>"Fund Research. Support Families. Fight Brain Cancer."</w:t>
+      </w:r>
+      <w:r>
+        <w:t xml:space="preserve"> in the hero.</w:t>
+      </w:r>
+    </w:p>
+    <w:p>
+      <w:pPr>
+        <w:pStyle w:val="Heading3"/>
+      </w:pPr>
+      <w:r>
+        <w:rPr>
+          <w:color w:val="181D27"/>
+        </w:rPr>
+        <w:t>8. Remove all "advocacy" / "lobbying" / "policy" language sitewide</w:t>
+      </w:r>
+    </w:p>
+    <w:p>
+      <w:pPr>
+        <w:pStyle w:val="ListBullet"/>
+      </w:pPr>
+      <w:r>
+        <w:rPr>
+          <w:b/>
+        </w:rPr>
+        <w:t>Pages:</w:t>
+      </w:r>
+      <w:r>
+        <w:t xml:space="preserve"> all (spotted in the hero subhead and the Awareness card)</w:t>
+      </w:r>
+    </w:p>
+    <w:p>
+      <w:pPr>
+        <w:pStyle w:val="ListBullet"/>
+      </w:pPr>
+      <w:r>
+        <w:rPr>
+          <w:b/>
+        </w:rPr>
+        <w:t>Problem:</w:t>
+      </w:r>
+      <w:r>
+        <w:t xml:space="preserve"> Advocacy/lobbying language is back — e.g., hero subhead "research, advocacy, and care" and the awareness card "Support research and policy advocacy." Advocacy/lobbying was </w:t>
+      </w:r>
+      <w:r>
+        <w:rPr>
+          <w:b/>
+        </w:rPr>
+        <w:t>deliberately removed</w:t>
+      </w:r>
+      <w:r>
+        <w:t xml:space="preserve"> from all BRF materials.</w:t>
+      </w:r>
+    </w:p>
+    <w:p>
+      <w:pPr>
+        <w:pStyle w:val="ListBullet"/>
+      </w:pPr>
+      <w:r>
+        <w:rPr>
+          <w:b/>
+        </w:rPr>
+        <w:t>Change:</w:t>
+      </w:r>
+      <w:r>
+        <w:t xml:space="preserve"> Remove "advocacy," "lobbying," and "policy advocacy" everywhere. Reframe those pillars around </w:t>
+      </w:r>
+      <w:r>
+        <w:rPr>
+          <w:b/>
+        </w:rPr>
+        <w:t>research funding, family support, and awareness</w:t>
+      </w:r>
+      <w:r>
+        <w:t xml:space="preserve"> (canonical wording — confirm exact phrasing with owner; the mission cards currently say "Research Funding / Family Support / Raising Awareness," which is close but confirm).</w:t>
+      </w:r>
+    </w:p>
+    <w:p>
+      <w:pPr>
+        <w:pStyle w:val="Heading3"/>
+      </w:pPr>
+      <w:r>
+        <w:rPr>
+          <w:color w:val="181D27"/>
+        </w:rPr>
+        <w:t>9. Fix Milan's title — President &amp; Co-Founder (not CEO)</w:t>
+      </w:r>
+    </w:p>
+    <w:p>
+      <w:pPr>
+        <w:pStyle w:val="ListBullet"/>
+      </w:pPr>
+      <w:r>
+        <w:rPr>
+          <w:b/>
+        </w:rPr>
+        <w:t>Pages:</w:t>
+      </w:r>
+      <w:r>
+        <w:t xml:space="preserve"> anywhere Milan appears (e.g., the homepage pull-quote "Milan Mehta, CEO")</w:t>
+      </w:r>
+    </w:p>
+    <w:p>
+      <w:pPr>
+        <w:pStyle w:val="ListBullet"/>
+      </w:pPr>
+      <w:r>
+        <w:rPr>
+          <w:b/>
+        </w:rPr>
+        <w:t>Change:</w:t>
+      </w:r>
+      <w:r>
+        <w:t xml:space="preserve"> Change "CEO" to </w:t>
+      </w:r>
+      <w:r>
+        <w:rPr>
+          <w:b/>
+        </w:rPr>
+        <w:t>"President &amp; Co-Founder"</w:t>
+      </w:r>
+      <w:r>
+        <w:t xml:space="preserve"> wherever Milan is credited.</w:t>
+      </w:r>
+    </w:p>
+    <w:p>
+      <w:pPr>
+        <w:pStyle w:val="ListBullet"/>
+      </w:pPr>
+      <w:r>
+        <w:rPr>
+          <w:b/>
+        </w:rPr>
+        <w:t>Note:</w:t>
+      </w:r>
+      <w:r>
+        <w:t xml:space="preserve"> Legacy NKBR content lists him as "CEO" — that's the old role; BRF title is President &amp; Co-Founder.</w:t>
+      </w:r>
+    </w:p>
+    <w:p>
+      <w:pPr>
+        <w:pStyle w:val="Heading3"/>
+      </w:pPr>
+      <w:r>
+        <w:rPr>
+          <w:color w:val="181D27"/>
+        </w:rPr>
+        <w:t>10. "$100,000 in Research Grants" stat — remove or reframe (legacy-framing rule)</w:t>
+      </w:r>
+    </w:p>
+    <w:p>
+      <w:pPr>
+        <w:pStyle w:val="ListBullet"/>
+      </w:pPr>
+      <w:r>
+        <w:rPr>
+          <w:b/>
+        </w:rPr>
+        <w:t>Page:</w:t>
+      </w:r>
+      <w:r>
+        <w:t xml:space="preserve"> Home / Impact (stat tied to a DDRFA funding-partner logo)</w:t>
+      </w:r>
+    </w:p>
+    <w:p>
+      <w:pPr>
+        <w:pStyle w:val="ListBullet"/>
+      </w:pPr>
+      <w:r>
+        <w:rPr>
+          <w:b/>
+        </w:rPr>
+        <w:t>Problem:</w:t>
+      </w:r>
+      <w:r>
+        <w:t xml:space="preserve"> If "$100,000 in Research Grants" is presented as a </w:t>
+      </w:r>
+      <w:r>
+        <w:rPr>
+          <w:b/>
+        </w:rPr>
+        <w:t>BRF</w:t>
+      </w:r>
+      <w:r>
+        <w:t xml:space="preserve"> achievement, it violates the legacy rule — BRF is brand new; the $300K+ track record belongs to the </w:t>
+      </w:r>
+      <w:r>
+        <w:rPr>
+          <w:b/>
+        </w:rPr>
+        <w:t>founding team / NKBR era</w:t>
+      </w:r>
+      <w:r>
+        <w:t>, not BRF.</w:t>
+      </w:r>
+    </w:p>
+    <w:p>
+      <w:pPr>
+        <w:pStyle w:val="ListBullet"/>
+      </w:pPr>
+      <w:r>
+        <w:rPr>
+          <w:b/>
+        </w:rPr>
+        <w:t>Change:</w:t>
+      </w:r>
+      <w:r>
+        <w:t xml:space="preserve"> Do </w:t>
+      </w:r>
+      <w:r>
+        <w:rPr>
+          <w:b/>
+        </w:rPr>
+        <w:t>not</w:t>
+      </w:r>
+      <w:r>
+        <w:t xml:space="preserve"> present this as BRF's achievement. Either remove it, or reframe it as the co-founders' prior work with the former foundation (see item 5). Confirm what the $100K figure actually represents before launch.</w:t>
+      </w:r>
+    </w:p>
+    <w:p>
+      <w:pPr>
+        <w:pStyle w:val="Heading3"/>
+      </w:pPr>
+      <w:r>
+        <w:rPr>
+          <w:color w:val="181D27"/>
+        </w:rPr>
+        <w:t>11. Events — replace placeholders with real events (Blackhawk gala headlines)</w:t>
+      </w:r>
+    </w:p>
+    <w:p>
+      <w:pPr>
+        <w:pStyle w:val="ListBullet"/>
+      </w:pPr>
+      <w:r>
+        <w:rPr>
+          <w:b/>
+        </w:rPr>
+        <w:t>Pages:</w:t>
+      </w:r>
+      <w:r>
+        <w:t xml:space="preserve"> Events section/page (and per item 2, keep Events </w:t>
+      </w:r>
+      <w:r>
+        <w:rPr>
+          <w:b/>
+        </w:rPr>
+        <w:t>off</w:t>
+      </w:r>
+      <w:r>
+        <w:t xml:space="preserve"> the landing page at launch)</w:t>
+      </w:r>
+    </w:p>
+    <w:p>
+      <w:pPr>
+        <w:pStyle w:val="ListBullet"/>
+      </w:pPr>
+      <w:r>
+        <w:rPr>
+          <w:b/>
+        </w:rPr>
+        <w:t>Problem:</w:t>
+      </w:r>
+      <w:r>
+        <w:t xml:space="preserve"> Events are all placeholder — four identical "Community Fundraiser / Support Session, Pleasanton, CA" cards reusing the "Every two minutes…" line.</w:t>
+      </w:r>
+    </w:p>
+    <w:p>
+      <w:pPr>
+        <w:pStyle w:val="ListBullet"/>
+      </w:pPr>
+      <w:r>
+        <w:rPr>
+          <w:b/>
+        </w:rPr>
+        <w:t>Change:</w:t>
+      </w:r>
+      <w:r>
+        <w:t xml:space="preserve"> Replace with </w:t>
+      </w:r>
+      <w:r>
+        <w:rPr>
+          <w:b/>
+        </w:rPr>
+        <w:t>real events</w:t>
+      </w:r>
+      <w:r>
+        <w:t xml:space="preserve">; the </w:t>
+      </w:r>
+      <w:r>
+        <w:rPr>
+          <w:b/>
+        </w:rPr>
+        <w:t>Nov 21 Blackhawk gala</w:t>
+      </w:r>
+      <w:r>
+        <w:t xml:space="preserve"> should headline.</w:t>
+      </w:r>
+    </w:p>
+    <w:p>
+      <w:pPr>
+        <w:pStyle w:val="Heading3"/>
+      </w:pPr>
+      <w:r>
+        <w:rPr>
+          <w:color w:val="181D27"/>
+        </w:rPr>
+        <w:t>12. Technical launch-blockers</w:t>
+      </w:r>
+    </w:p>
+    <w:p>
+      <w:pPr>
+        <w:pStyle w:val="ListBullet"/>
+      </w:pPr>
+      <w:r>
+        <w:rPr>
+          <w:b/>
+        </w:rPr>
+        <w:t>Page:</w:t>
+      </w:r>
+      <w:r>
+        <w:t xml:space="preserve"> site-wide (head/meta)</w:t>
+      </w:r>
+    </w:p>
+    <w:p>
+      <w:pPr>
+        <w:pStyle w:val="ListBullet"/>
+      </w:pPr>
+      <w:r>
+        <w:rPr>
+          <w:b/>
+        </w:rPr>
+        <w:t>A — noindex/nofollow:</w:t>
+      </w:r>
+      <w:r>
+        <w:t xml:space="preserve"> The page is set to </w:t>
+      </w:r>
+      <w:r>
+        <w:rPr>
+          <w:rFonts w:ascii="Consolas" w:hAnsi="Consolas"/>
+          <w:color w:val="C0392B"/>
+        </w:rPr>
+        <w:t>noindex, nofollow</w:t>
+      </w:r>
+      <w:r>
+        <w:t xml:space="preserve"> (fine for staging). </w:t>
+      </w:r>
+      <w:r>
+        <w:rPr>
+          <w:b/>
+        </w:rPr>
+        <w:t>Must be removed at launch</w:t>
+      </w:r>
+      <w:r>
+        <w:t xml:space="preserve"> so search engines can index the site.</w:t>
+      </w:r>
+    </w:p>
+    <w:p>
+      <w:pPr>
+        <w:pStyle w:val="ListBullet"/>
+      </w:pPr>
+      <w:r>
+        <w:rPr>
+          <w:b/>
+        </w:rPr>
+        <w:t>B — Broken og:image:</w:t>
+      </w:r>
+      <w:r>
+        <w:t xml:space="preserve"> The Open Graph image points to a broken local dev URL (</w:t>
+      </w:r>
+      <w:r>
+        <w:rPr>
+          <w:rFonts w:ascii="Consolas" w:hAnsi="Consolas"/>
+          <w:color w:val="C0392B"/>
+        </w:rPr>
+        <w:t>brave-ronil.local/...burst.svg</w:t>
+      </w:r>
+      <w:r>
+        <w:t xml:space="preserve">). </w:t>
+      </w:r>
+      <w:r>
+        <w:rPr>
+          <w:b/>
+        </w:rPr>
+        <w:t>Fix to a real hosted image</w:t>
+      </w:r>
+      <w:r>
+        <w:t xml:space="preserve"> or social shares won't render a preview.</w:t>
+      </w:r>
+    </w:p>
     <w:p/>
     <w:p>
       <w:pPr>

</xml_diff>